<commit_message>
Türkçe afet tweet sınıflandırma — QLoRA benchmark review
</commit_message>
<xml_diff>
--- a/report/FinalRaporu_Mustafa_Kirpik.docx
+++ b/report/FinalRaporu_Mustafa_Kirpik.docx
@@ -135,7 +135,7 @@
         <w:jc w:val="both"/>
       </w:pPr>
       <w:r>
-        <w:t xml:space="preserve">Bu çalışma, 2023 Kahramanmaraş depremleri sırasında paylaşılan Türkçe tweet'lerin beş operasyonel sınıfa (yardım talebi, kayıp bildirimi, altyapı hasarı, bağış/koordinasyon, diğer/ilgisiz) otomatik olarak ayrılması problemini ele almaktadır. Çalışmada 793 adet elle etiketlenmiş gerçek tweet'ten oluşan bir veri seti kullanılmış; sınırlı donanımda çalışabilen üç Küçük Dil Modeli (SmolLM2-360M, TinyLlama-1.1B, Qwen2.5-1.5B) QLoRA (4-bit NormalFloat) yöntemiyle ince ayarlanmıştır. Sonuçlar, zero-shot temel çizginin görevde tamamen başarısız olduğunu (Macro-F1 0.094), QLoRA ince ayarının ise performansı çarpıcı biçimde artırdığını göstermektedir (en yüksek Macro-F1 0.914, Qwen2.5). Modeller arasında belirgin bir ölçek etkisi gözlenmiş, ancak ~1 milyar parametre civarında getirinin azaldığı saptanmıştır. QLoRA'nın tepe GPU bellek kullanımı 1.81–5.07 GB aralığında kalmıştır. Çalışma, Saliha Göçergi'nin LoRA çalışmasıyla koordineli yürütülmüş olup, LoRA–QLoRA karşılaştırması da kapsama dahildir.</w:t>
+        <w:t xml:space="preserve">Bu çalışma, 2023 Kahramanmaraş depremleri sırasında paylaşılan Türkçe tweet'lerin beş operasyonel sınıfa (yardım talebi, kayıp bildirimi, altyapı hasarı, bağış/koordinasyon, diğer/ilgisiz) otomatik olarak ayrılması problemini ele almaktadır. Çalışmada 793 adet elle etiketlenmiş gerçek tweet'ten oluşan bir veri seti kullanılmış; sınırlı donanımda çalışabilen dört Küçük Dil Modeli (SmolLM2-360M, TinyLlama-1.1B, Qwen2.5-1.5B, Gemma-4-E2B) QLoRA (4-bit NormalFloat) yöntemiyle ince ayarlanmıştır. Sonuçlar, zero-shot temel çizginin görevde tamamen başarısız olduğunu (Macro-F1 0.094), QLoRA ince ayarının ise performansı çarpıcı biçimde artırdığını göstermektedir (en yüksek Macro-F1 0.914, Qwen2.5). Modeller arasında belirgin ancak doğrusal olmayan bir ölçek etkisi gözlenmiştir: 1–1.5 milyar parametre aralığı en iyi başarı–kaynak dengesini sağlarken, en büyük model Gemma-4-E2B (5B ham / efektif ~2B) küçük veri kümesinde aşırı uydurma yaşamış ve daha küçük modellerin gerisinde kalmıştır (Macro-F1 0.740). QLoRA'nın tepe GPU bellek kullanımı 1.81–9.73 GB aralığında kalmıştır. Çalışma, Saliha Göçergi'nin LoRA çalışmasıyla koordineli yürütülmüş olup, LoRA–QLoRA karşılaştırması da kapsama dahildir.</w:t>
       </w:r>
     </w:p>
     <w:p>
@@ -250,7 +250,7 @@
         <w:spacing w:after="80"/>
       </w:pPr>
       <w:r>
-        <w:t xml:space="preserve">793 örneklik, beş sınıfa elle etiketlenmiş Türkçe deprem tweet veri seti.</w:t>
+        <w:t xml:space="preserve">Kaggle'daki açık "Turkey Earthquake Relief Tweets" havuzundan seçilen, beş sınıfa elle etiketlenmiş 793 örneklik Türkçe afet tweet veri seti.</w:t>
       </w:r>
     </w:p>
     <w:p>
@@ -330,7 +330,7 @@
         <w:jc w:val="both"/>
       </w:pPr>
       <w:r>
-        <w:t xml:space="preserve">Toraman ve arkadaşları (2023) "Tweets Under the Rubble" çalışmasında, Kahramanmaraş depreminin ilk saatlerinde paylaşılan milyonlarca tweet'i analiz ederek yardım çağrılarının tespitine odaklanmış ve BERTurk türü modellerle yüksek başarı elde etmiştir. Bu çalışmalar büyük, görev-özel modellerin gücünü gösterse de, edge cihaz uygulanabilirliği sınırlıdır.</w:t>
+        <w:t xml:space="preserve">Toraman ve arkadaşları (2023) "Tweets Under the Rubble" çalışmasında, Kahramanmaraş depreminin ilk saatlerinde paylaşılan milyonlarca tweet'i analiz ederek yardım çağrılarının tespitine odaklanmış ve BERTurk türü modellerle yüksek başarı elde etmiştir. Bu çalışma, Türkçe afet metni sınıflandırması için ilgili ve öncü bir literatür referansıdır; bu projenin veri kaynağı değildir (bizim verimiz ayrı bir Kaggle veri setinden gelmektedir; bkz. Bölüm 3). Söz konusu çalışmalar büyük, görev-özel modellerin gücünü gösterse de, edge cihaz uygulanabilirliği sınırlıdır; bu proje ise küçük modellerin parametre verimli ince ayarına odaklanır.</w:t>
       </w:r>
     </w:p>
     <w:p>
@@ -380,7 +380,7 @@
         <w:jc w:val="both"/>
       </w:pPr>
       <w:r>
-        <w:t xml:space="preserve">Çalışmada, deprem dönemine ait gerçek tweet'lerden oluşan ve tamamı bu proje kapsamında beş sınıfa elle etiketlenmiş 793 örneklik bir veri seti kullanılmıştır. Etiketleme, sınıf tanımlarına bağlı kalınarak manuel olarak yapılmıştır; bu yaklaşım, gürültülü zayıf etiketleme veya sentetik veri üretiminin yaratabileceği etiket gürültüsü ve örüntü yanlılığını ortadan kaldırarak yüksek etiket kalitesi sağlamıştır.</w:t>
+        <w:t xml:space="preserve">Çalışmada kullanılan ham tweet'ler, Kaggle üzerinde yayımlanmış açık erişimli "Turkey Earthquake Relief Tweets Dataset" (Ulku Tuncer Küçüktaş, 2023) veri setinden alınmıştır. Bu havuzdan seçilen 793 gerçek deprem tweet'i, bu proje kapsamında beş sınıfa elle etiketlenmiştir. Etiketleme, sınıf tanımlarına bağlı kalınarak manuel olarak yapılmıştır; yani ham metin Kaggle kaynağından gelirken, beş sınıflı etiketler tümüyle bu çalışmaya özgüdür. Bu yaklaşım, gürültülü zayıf etiketleme veya sentetik veri üretiminin yaratabileceği etiket gürültüsü ve örüntü yanlılığını ortadan kaldırarak yüksek etiket kalitesi sağlamıştır.</w:t>
       </w:r>
     </w:p>
     <w:p>
@@ -1816,7 +1816,7 @@
                 <w:sz w:val="19"/>
                 <w:szCs w:val="19"/>
               </w:rPr>
-              <w:t xml:space="preserve">Gemma-4-E2B-it (planlanan)</w:t>
+              <w:t xml:space="preserve">Gemma-4-E2B-it</w:t>
             </w:r>
           </w:p>
         </w:tc>
@@ -1847,7 +1847,7 @@
                 <w:sz w:val="19"/>
                 <w:szCs w:val="19"/>
               </w:rPr>
-              <w:t xml:space="preserve">~2B*</w:t>
+              <w:t xml:space="preserve">5B ham / ~2B efektif</w:t>
             </w:r>
           </w:p>
         </w:tc>
@@ -1878,7 +1878,7 @@
                 <w:sz w:val="19"/>
                 <w:szCs w:val="19"/>
               </w:rPr>
-              <w:t xml:space="preserve">google/gemma-4-E2B-it</w:t>
+              <w:t xml:space="preserve">google/gemma-4-E2B-it (Unsloth)</w:t>
             </w:r>
           </w:p>
         </w:tc>
@@ -1896,7 +1896,7 @@
           <w:sz w:val="20"/>
           <w:szCs w:val="20"/>
         </w:rPr>
-        <w:t xml:space="preserve">Tablo 2. Kullanılan modeller (*efektif ~2B; Gemma-4 4. model olarak planlanmıştır)</w:t>
+        <w:t xml:space="preserve">Tablo 2. Kullanılan dört model (Gemma-4 multimodal; metin-only kullanım)</w:t>
       </w:r>
     </w:p>
     <w:p>
@@ -3888,6 +3888,256 @@
           </w:p>
         </w:tc>
       </w:tr>
+      <w:tr>
+        <w:tc>
+          <w:tcPr>
+            <w:tcW w:type="dxa" w:w="1900"/>
+            <w:tcBorders>
+              <w:top w:val="single" w:color="999999" w:sz="4"/>
+              <w:left w:val="single" w:color="999999" w:sz="4"/>
+              <w:bottom w:val="single" w:color="999999" w:sz="4"/>
+              <w:right w:val="single" w:color="999999" w:sz="4"/>
+            </w:tcBorders>
+            <w:tcMar>
+              <w:top w:type="dxa" w:w="70"/>
+              <w:left w:type="dxa" w:w="110"/>
+              <w:bottom w:type="dxa" w:w="70"/>
+              <w:right w:type="dxa" w:w="110"/>
+            </w:tcMar>
+          </w:tcPr>
+          <w:p>
+            <w:pPr>
+              <w:jc w:val="left"/>
+            </w:pPr>
+            <w:r>
+              <w:rPr>
+                <w:b w:val="false"/>
+                <w:bCs w:val="false"/>
+                <w:sz w:val="19"/>
+                <w:szCs w:val="19"/>
+              </w:rPr>
+              <w:t xml:space="preserve">Gemma-4-E2B (5B)</w:t>
+            </w:r>
+          </w:p>
+        </w:tc>
+        <w:tc>
+          <w:tcPr>
+            <w:tcW w:type="dxa" w:w="1250"/>
+            <w:tcBorders>
+              <w:top w:val="single" w:color="999999" w:sz="4"/>
+              <w:left w:val="single" w:color="999999" w:sz="4"/>
+              <w:bottom w:val="single" w:color="999999" w:sz="4"/>
+              <w:right w:val="single" w:color="999999" w:sz="4"/>
+            </w:tcBorders>
+            <w:tcMar>
+              <w:top w:type="dxa" w:w="70"/>
+              <w:left w:type="dxa" w:w="110"/>
+              <w:bottom w:type="dxa" w:w="70"/>
+              <w:right w:type="dxa" w:w="110"/>
+            </w:tcMar>
+          </w:tcPr>
+          <w:p>
+            <w:pPr>
+              <w:jc w:val="center"/>
+            </w:pPr>
+            <w:r>
+              <w:rPr>
+                <w:b w:val="false"/>
+                <w:bCs w:val="false"/>
+                <w:sz w:val="19"/>
+                <w:szCs w:val="19"/>
+              </w:rPr>
+              <w:t xml:space="preserve">QLoRA (Unsloth)</w:t>
+            </w:r>
+          </w:p>
+        </w:tc>
+        <w:tc>
+          <w:tcPr>
+            <w:tcW w:type="dxa" w:w="900"/>
+            <w:tcBorders>
+              <w:top w:val="single" w:color="999999" w:sz="4"/>
+              <w:left w:val="single" w:color="999999" w:sz="4"/>
+              <w:bottom w:val="single" w:color="999999" w:sz="4"/>
+              <w:right w:val="single" w:color="999999" w:sz="4"/>
+            </w:tcBorders>
+            <w:tcMar>
+              <w:top w:type="dxa" w:w="70"/>
+              <w:left w:type="dxa" w:w="110"/>
+              <w:bottom w:type="dxa" w:w="70"/>
+              <w:right w:type="dxa" w:w="110"/>
+            </w:tcMar>
+          </w:tcPr>
+          <w:p>
+            <w:pPr>
+              <w:jc w:val="center"/>
+            </w:pPr>
+            <w:r>
+              <w:rPr>
+                <w:b w:val="false"/>
+                <w:bCs w:val="false"/>
+                <w:sz w:val="19"/>
+                <w:szCs w:val="19"/>
+              </w:rPr>
+              <w:t xml:space="preserve">0.788</w:t>
+            </w:r>
+          </w:p>
+        </w:tc>
+        <w:tc>
+          <w:tcPr>
+            <w:tcW w:type="dxa" w:w="1100"/>
+            <w:tcBorders>
+              <w:top w:val="single" w:color="999999" w:sz="4"/>
+              <w:left w:val="single" w:color="999999" w:sz="4"/>
+              <w:bottom w:val="single" w:color="999999" w:sz="4"/>
+              <w:right w:val="single" w:color="999999" w:sz="4"/>
+            </w:tcBorders>
+            <w:tcMar>
+              <w:top w:type="dxa" w:w="70"/>
+              <w:left w:type="dxa" w:w="110"/>
+              <w:bottom w:type="dxa" w:w="70"/>
+              <w:right w:type="dxa" w:w="110"/>
+            </w:tcMar>
+          </w:tcPr>
+          <w:p>
+            <w:pPr>
+              <w:jc w:val="center"/>
+            </w:pPr>
+            <w:r>
+              <w:rPr>
+                <w:b w:val="false"/>
+                <w:bCs w:val="false"/>
+                <w:sz w:val="19"/>
+                <w:szCs w:val="19"/>
+              </w:rPr>
+              <w:t xml:space="preserve">0.740</w:t>
+            </w:r>
+          </w:p>
+        </w:tc>
+        <w:tc>
+          <w:tcPr>
+            <w:tcW w:type="dxa" w:w="1050"/>
+            <w:tcBorders>
+              <w:top w:val="single" w:color="999999" w:sz="4"/>
+              <w:left w:val="single" w:color="999999" w:sz="4"/>
+              <w:bottom w:val="single" w:color="999999" w:sz="4"/>
+              <w:right w:val="single" w:color="999999" w:sz="4"/>
+            </w:tcBorders>
+            <w:tcMar>
+              <w:top w:type="dxa" w:w="70"/>
+              <w:left w:type="dxa" w:w="110"/>
+              <w:bottom w:type="dxa" w:w="70"/>
+              <w:right w:type="dxa" w:w="110"/>
+            </w:tcMar>
+          </w:tcPr>
+          <w:p>
+            <w:pPr>
+              <w:jc w:val="center"/>
+            </w:pPr>
+            <w:r>
+              <w:rPr>
+                <w:b w:val="false"/>
+                <w:bCs w:val="false"/>
+                <w:sz w:val="19"/>
+                <w:szCs w:val="19"/>
+              </w:rPr>
+              <w:t xml:space="preserve">0.765</w:t>
+            </w:r>
+          </w:p>
+        </w:tc>
+        <w:tc>
+          <w:tcPr>
+            <w:tcW w:type="dxa" w:w="950"/>
+            <w:tcBorders>
+              <w:top w:val="single" w:color="999999" w:sz="4"/>
+              <w:left w:val="single" w:color="999999" w:sz="4"/>
+              <w:bottom w:val="single" w:color="999999" w:sz="4"/>
+              <w:right w:val="single" w:color="999999" w:sz="4"/>
+            </w:tcBorders>
+            <w:tcMar>
+              <w:top w:type="dxa" w:w="70"/>
+              <w:left w:type="dxa" w:w="110"/>
+              <w:bottom w:type="dxa" w:w="70"/>
+              <w:right w:type="dxa" w:w="110"/>
+            </w:tcMar>
+          </w:tcPr>
+          <w:p>
+            <w:pPr>
+              <w:jc w:val="center"/>
+            </w:pPr>
+            <w:r>
+              <w:rPr>
+                <w:b w:val="false"/>
+                <w:bCs w:val="false"/>
+                <w:sz w:val="19"/>
+                <w:szCs w:val="19"/>
+              </w:rPr>
+              <w:t xml:space="preserve">1798</w:t>
+            </w:r>
+          </w:p>
+        </w:tc>
+        <w:tc>
+          <w:tcPr>
+            <w:tcW w:type="dxa" w:w="1050"/>
+            <w:tcBorders>
+              <w:top w:val="single" w:color="999999" w:sz="4"/>
+              <w:left w:val="single" w:color="999999" w:sz="4"/>
+              <w:bottom w:val="single" w:color="999999" w:sz="4"/>
+              <w:right w:val="single" w:color="999999" w:sz="4"/>
+            </w:tcBorders>
+            <w:tcMar>
+              <w:top w:type="dxa" w:w="70"/>
+              <w:left w:type="dxa" w:w="110"/>
+              <w:bottom w:type="dxa" w:w="70"/>
+              <w:right w:type="dxa" w:w="110"/>
+            </w:tcMar>
+          </w:tcPr>
+          <w:p>
+            <w:pPr>
+              <w:jc w:val="center"/>
+            </w:pPr>
+            <w:r>
+              <w:rPr>
+                <w:b w:val="false"/>
+                <w:bCs w:val="false"/>
+                <w:sz w:val="19"/>
+                <w:szCs w:val="19"/>
+              </w:rPr>
+              <w:t xml:space="preserve">9.73</w:t>
+            </w:r>
+          </w:p>
+        </w:tc>
+        <w:tc>
+          <w:tcPr>
+            <w:tcW w:type="dxa" w:w="1160"/>
+            <w:tcBorders>
+              <w:top w:val="single" w:color="999999" w:sz="4"/>
+              <w:left w:val="single" w:color="999999" w:sz="4"/>
+              <w:bottom w:val="single" w:color="999999" w:sz="4"/>
+              <w:right w:val="single" w:color="999999" w:sz="4"/>
+            </w:tcBorders>
+            <w:tcMar>
+              <w:top w:type="dxa" w:w="70"/>
+              <w:left w:type="dxa" w:w="110"/>
+              <w:bottom w:type="dxa" w:w="70"/>
+              <w:right w:type="dxa" w:w="110"/>
+            </w:tcMar>
+          </w:tcPr>
+          <w:p>
+            <w:pPr>
+              <w:jc w:val="center"/>
+            </w:pPr>
+            <w:r>
+              <w:rPr>
+                <w:b w:val="false"/>
+                <w:bCs w:val="false"/>
+                <w:sz w:val="19"/>
+                <w:szCs w:val="19"/>
+              </w:rPr>
+              <w:t xml:space="preserve">718</w:t>
+            </w:r>
+          </w:p>
+        </w:tc>
+      </w:tr>
     </w:tbl>
     <w:p>
       <w:pPr>
@@ -3910,7 +4160,7 @@
         <w:jc w:val="both"/>
       </w:pPr>
       <w:r>
-        <w:t xml:space="preserve">Eğitilebilir parametre oranları (QLoRA): SmolLM2 3.28M (%0.90), TinyLlama 4.5M (%0.41), Qwen2.5 4.36M (%0.28). Tüm fine-tuned modeller test setinde 0/80 ayrıştırma hatası vermiştir; zero-shot ise 79/80 örnekte geçerli kategori üretememiştir.</w:t>
+        <w:t xml:space="preserve">Eğitilebilir parametre oranları (QLoRA): SmolLM2 3.28M (%0.90), TinyLlama 4.5M (%0.41), Qwen2.5 4.36M (%0.28), Gemma-4 31.04M (%0.60 — Unsloth'un Gemma için önerdiği genişletilmiş hedef modüller). Tüm fine-tuned modeller test setinde 0/80 ayrıştırma hatası vermiştir; zero-shot ise 79/80 örnekte geçerli kategori üretememiştir.</w:t>
       </w:r>
     </w:p>
     <w:p>
@@ -3935,10 +4185,11 @@
         </w:tblBorders>
       </w:tblPr>
       <w:tblGrid>
-        <w:gridCol w:w="3000"/>
-        <w:gridCol w:w="2120"/>
-        <w:gridCol w:w="2120"/>
-        <w:gridCol w:w="2120"/>
+        <w:gridCol w:w="2400"/>
+        <w:gridCol w:w="1740"/>
+        <w:gridCol w:w="1740"/>
+        <w:gridCol w:w="1740"/>
+        <w:gridCol w:w="1740"/>
       </w:tblGrid>
       <w:tr>
         <w:trPr>
@@ -3946,7 +4197,7 @@
         </w:trPr>
         <w:tc>
           <w:tcPr>
-            <w:tcW w:type="dxa" w:w="3000"/>
+            <w:tcW w:type="dxa" w:w="2400"/>
             <w:tcBorders>
               <w:top w:val="single" w:color="999999" w:sz="4"/>
               <w:left w:val="single" w:color="999999" w:sz="4"/>
@@ -3978,7 +4229,7 @@
         </w:tc>
         <w:tc>
           <w:tcPr>
-            <w:tcW w:type="dxa" w:w="2120"/>
+            <w:tcW w:type="dxa" w:w="1740"/>
             <w:tcBorders>
               <w:top w:val="single" w:color="999999" w:sz="4"/>
               <w:left w:val="single" w:color="999999" w:sz="4"/>
@@ -4010,7 +4261,7 @@
         </w:tc>
         <w:tc>
           <w:tcPr>
-            <w:tcW w:type="dxa" w:w="2120"/>
+            <w:tcW w:type="dxa" w:w="1740"/>
             <w:tcBorders>
               <w:top w:val="single" w:color="999999" w:sz="4"/>
               <w:left w:val="single" w:color="999999" w:sz="4"/>
@@ -4042,7 +4293,7 @@
         </w:tc>
         <w:tc>
           <w:tcPr>
-            <w:tcW w:type="dxa" w:w="2120"/>
+            <w:tcW w:type="dxa" w:w="1740"/>
             <w:tcBorders>
               <w:top w:val="single" w:color="999999" w:sz="4"/>
               <w:left w:val="single" w:color="999999" w:sz="4"/>
@@ -4072,11 +4323,43 @@
             </w:r>
           </w:p>
         </w:tc>
+        <w:tc>
+          <w:tcPr>
+            <w:tcW w:type="dxa" w:w="1740"/>
+            <w:tcBorders>
+              <w:top w:val="single" w:color="999999" w:sz="4"/>
+              <w:left w:val="single" w:color="999999" w:sz="4"/>
+              <w:bottom w:val="single" w:color="999999" w:sz="4"/>
+              <w:right w:val="single" w:color="999999" w:sz="4"/>
+            </w:tcBorders>
+            <w:shd w:fill="DEEBF7" w:val="clear"/>
+            <w:tcMar>
+              <w:top w:type="dxa" w:w="70"/>
+              <w:left w:type="dxa" w:w="110"/>
+              <w:bottom w:type="dxa" w:w="70"/>
+              <w:right w:type="dxa" w:w="110"/>
+            </w:tcMar>
+          </w:tcPr>
+          <w:p>
+            <w:pPr>
+              <w:jc w:val="center"/>
+            </w:pPr>
+            <w:r>
+              <w:rPr>
+                <w:b/>
+                <w:bCs/>
+                <w:sz w:val="19"/>
+                <w:szCs w:val="19"/>
+              </w:rPr>
+              <w:t xml:space="preserve">Gemma-4-E2B</w:t>
+            </w:r>
+          </w:p>
+        </w:tc>
       </w:tr>
       <w:tr>
         <w:tc>
           <w:tcPr>
-            <w:tcW w:type="dxa" w:w="3000"/>
+            <w:tcW w:type="dxa" w:w="2400"/>
             <w:tcBorders>
               <w:top w:val="single" w:color="999999" w:sz="4"/>
               <w:left w:val="single" w:color="999999" w:sz="4"/>
@@ -4107,7 +4390,7 @@
         </w:tc>
         <w:tc>
           <w:tcPr>
-            <w:tcW w:type="dxa" w:w="2120"/>
+            <w:tcW w:type="dxa" w:w="1740"/>
             <w:tcBorders>
               <w:top w:val="single" w:color="999999" w:sz="4"/>
               <w:left w:val="single" w:color="999999" w:sz="4"/>
@@ -4138,7 +4421,7 @@
         </w:tc>
         <w:tc>
           <w:tcPr>
-            <w:tcW w:type="dxa" w:w="2120"/>
+            <w:tcW w:type="dxa" w:w="1740"/>
             <w:tcBorders>
               <w:top w:val="single" w:color="999999" w:sz="4"/>
               <w:left w:val="single" w:color="999999" w:sz="4"/>
@@ -4169,7 +4452,7 @@
         </w:tc>
         <w:tc>
           <w:tcPr>
-            <w:tcW w:type="dxa" w:w="2120"/>
+            <w:tcW w:type="dxa" w:w="1740"/>
             <w:tcBorders>
               <w:top w:val="single" w:color="999999" w:sz="4"/>
               <w:left w:val="single" w:color="999999" w:sz="4"/>
@@ -4195,6 +4478,37 @@
                 <w:szCs w:val="19"/>
               </w:rPr>
               <w:t xml:space="preserve">0.95</w:t>
+            </w:r>
+          </w:p>
+        </w:tc>
+        <w:tc>
+          <w:tcPr>
+            <w:tcW w:type="dxa" w:w="1740"/>
+            <w:tcBorders>
+              <w:top w:val="single" w:color="999999" w:sz="4"/>
+              <w:left w:val="single" w:color="999999" w:sz="4"/>
+              <w:bottom w:val="single" w:color="999999" w:sz="4"/>
+              <w:right w:val="single" w:color="999999" w:sz="4"/>
+            </w:tcBorders>
+            <w:tcMar>
+              <w:top w:type="dxa" w:w="70"/>
+              <w:left w:type="dxa" w:w="110"/>
+              <w:bottom w:type="dxa" w:w="70"/>
+              <w:right w:type="dxa" w:w="110"/>
+            </w:tcMar>
+          </w:tcPr>
+          <w:p>
+            <w:pPr>
+              <w:jc w:val="center"/>
+            </w:pPr>
+            <w:r>
+              <w:rPr>
+                <w:b w:val="false"/>
+                <w:bCs w:val="false"/>
+                <w:sz w:val="19"/>
+                <w:szCs w:val="19"/>
+              </w:rPr>
+              <w:t xml:space="preserve">0.86</w:t>
             </w:r>
           </w:p>
         </w:tc>
@@ -4202,7 +4516,7 @@
       <w:tr>
         <w:tc>
           <w:tcPr>
-            <w:tcW w:type="dxa" w:w="3000"/>
+            <w:tcW w:type="dxa" w:w="2400"/>
             <w:tcBorders>
               <w:top w:val="single" w:color="999999" w:sz="4"/>
               <w:left w:val="single" w:color="999999" w:sz="4"/>
@@ -4233,7 +4547,7 @@
         </w:tc>
         <w:tc>
           <w:tcPr>
-            <w:tcW w:type="dxa" w:w="2120"/>
+            <w:tcW w:type="dxa" w:w="1740"/>
             <w:tcBorders>
               <w:top w:val="single" w:color="999999" w:sz="4"/>
               <w:left w:val="single" w:color="999999" w:sz="4"/>
@@ -4264,7 +4578,7 @@
         </w:tc>
         <w:tc>
           <w:tcPr>
-            <w:tcW w:type="dxa" w:w="2120"/>
+            <w:tcW w:type="dxa" w:w="1740"/>
             <w:tcBorders>
               <w:top w:val="single" w:color="999999" w:sz="4"/>
               <w:left w:val="single" w:color="999999" w:sz="4"/>
@@ -4295,7 +4609,7 @@
         </w:tc>
         <w:tc>
           <w:tcPr>
-            <w:tcW w:type="dxa" w:w="2120"/>
+            <w:tcW w:type="dxa" w:w="1740"/>
             <w:tcBorders>
               <w:top w:val="single" w:color="999999" w:sz="4"/>
               <w:left w:val="single" w:color="999999" w:sz="4"/>
@@ -4321,6 +4635,37 @@
                 <w:szCs w:val="19"/>
               </w:rPr>
               <w:t xml:space="preserve">0.89</w:t>
+            </w:r>
+          </w:p>
+        </w:tc>
+        <w:tc>
+          <w:tcPr>
+            <w:tcW w:type="dxa" w:w="1740"/>
+            <w:tcBorders>
+              <w:top w:val="single" w:color="999999" w:sz="4"/>
+              <w:left w:val="single" w:color="999999" w:sz="4"/>
+              <w:bottom w:val="single" w:color="999999" w:sz="4"/>
+              <w:right w:val="single" w:color="999999" w:sz="4"/>
+            </w:tcBorders>
+            <w:tcMar>
+              <w:top w:type="dxa" w:w="70"/>
+              <w:left w:type="dxa" w:w="110"/>
+              <w:bottom w:type="dxa" w:w="70"/>
+              <w:right w:type="dxa" w:w="110"/>
+            </w:tcMar>
+          </w:tcPr>
+          <w:p>
+            <w:pPr>
+              <w:jc w:val="center"/>
+            </w:pPr>
+            <w:r>
+              <w:rPr>
+                <w:b w:val="false"/>
+                <w:bCs w:val="false"/>
+                <w:sz w:val="19"/>
+                <w:szCs w:val="19"/>
+              </w:rPr>
+              <w:t xml:space="preserve">0.46</w:t>
             </w:r>
           </w:p>
         </w:tc>
@@ -4328,7 +4673,7 @@
       <w:tr>
         <w:tc>
           <w:tcPr>
-            <w:tcW w:type="dxa" w:w="3000"/>
+            <w:tcW w:type="dxa" w:w="2400"/>
             <w:tcBorders>
               <w:top w:val="single" w:color="999999" w:sz="4"/>
               <w:left w:val="single" w:color="999999" w:sz="4"/>
@@ -4359,7 +4704,7 @@
         </w:tc>
         <w:tc>
           <w:tcPr>
-            <w:tcW w:type="dxa" w:w="2120"/>
+            <w:tcW w:type="dxa" w:w="1740"/>
             <w:tcBorders>
               <w:top w:val="single" w:color="999999" w:sz="4"/>
               <w:left w:val="single" w:color="999999" w:sz="4"/>
@@ -4390,7 +4735,7 @@
         </w:tc>
         <w:tc>
           <w:tcPr>
-            <w:tcW w:type="dxa" w:w="2120"/>
+            <w:tcW w:type="dxa" w:w="1740"/>
             <w:tcBorders>
               <w:top w:val="single" w:color="999999" w:sz="4"/>
               <w:left w:val="single" w:color="999999" w:sz="4"/>
@@ -4421,7 +4766,7 @@
         </w:tc>
         <w:tc>
           <w:tcPr>
-            <w:tcW w:type="dxa" w:w="2120"/>
+            <w:tcW w:type="dxa" w:w="1740"/>
             <w:tcBorders>
               <w:top w:val="single" w:color="999999" w:sz="4"/>
               <w:left w:val="single" w:color="999999" w:sz="4"/>
@@ -4447,6 +4792,37 @@
                 <w:szCs w:val="19"/>
               </w:rPr>
               <w:t xml:space="preserve">1.00</w:t>
+            </w:r>
+          </w:p>
+        </w:tc>
+        <w:tc>
+          <w:tcPr>
+            <w:tcW w:type="dxa" w:w="1740"/>
+            <w:tcBorders>
+              <w:top w:val="single" w:color="999999" w:sz="4"/>
+              <w:left w:val="single" w:color="999999" w:sz="4"/>
+              <w:bottom w:val="single" w:color="999999" w:sz="4"/>
+              <w:right w:val="single" w:color="999999" w:sz="4"/>
+            </w:tcBorders>
+            <w:tcMar>
+              <w:top w:type="dxa" w:w="70"/>
+              <w:left w:type="dxa" w:w="110"/>
+              <w:bottom w:type="dxa" w:w="70"/>
+              <w:right w:type="dxa" w:w="110"/>
+            </w:tcMar>
+          </w:tcPr>
+          <w:p>
+            <w:pPr>
+              <w:jc w:val="center"/>
+            </w:pPr>
+            <w:r>
+              <w:rPr>
+                <w:b w:val="false"/>
+                <w:bCs w:val="false"/>
+                <w:sz w:val="19"/>
+                <w:szCs w:val="19"/>
+              </w:rPr>
+              <w:t xml:space="preserve">0.91</w:t>
             </w:r>
           </w:p>
         </w:tc>
@@ -4454,7 +4830,7 @@
       <w:tr>
         <w:tc>
           <w:tcPr>
-            <w:tcW w:type="dxa" w:w="3000"/>
+            <w:tcW w:type="dxa" w:w="2400"/>
             <w:tcBorders>
               <w:top w:val="single" w:color="999999" w:sz="4"/>
               <w:left w:val="single" w:color="999999" w:sz="4"/>
@@ -4484,7 +4860,7 @@
         </w:tc>
         <w:tc>
           <w:tcPr>
-            <w:tcW w:type="dxa" w:w="2120"/>
+            <w:tcW w:type="dxa" w:w="1740"/>
             <w:tcBorders>
               <w:top w:val="single" w:color="999999" w:sz="4"/>
               <w:left w:val="single" w:color="999999" w:sz="4"/>
@@ -4514,7 +4890,7 @@
         </w:tc>
         <w:tc>
           <w:tcPr>
-            <w:tcW w:type="dxa" w:w="2120"/>
+            <w:tcW w:type="dxa" w:w="1740"/>
             <w:tcBorders>
               <w:top w:val="single" w:color="999999" w:sz="4"/>
               <w:left w:val="single" w:color="999999" w:sz="4"/>
@@ -4544,7 +4920,7 @@
         </w:tc>
         <w:tc>
           <w:tcPr>
-            <w:tcW w:type="dxa" w:w="2120"/>
+            <w:tcW w:type="dxa" w:w="1740"/>
             <w:tcBorders>
               <w:top w:val="single" w:color="999999" w:sz="4"/>
               <w:left w:val="single" w:color="999999" w:sz="4"/>
@@ -4569,6 +4945,36 @@
                 <w:szCs w:val="19"/>
               </w:rPr>
               <w:t xml:space="preserve">0.78</w:t>
+            </w:r>
+          </w:p>
+        </w:tc>
+        <w:tc>
+          <w:tcPr>
+            <w:tcW w:type="dxa" w:w="1740"/>
+            <w:tcBorders>
+              <w:top w:val="single" w:color="999999" w:sz="4"/>
+              <w:left w:val="single" w:color="999999" w:sz="4"/>
+              <w:bottom w:val="single" w:color="999999" w:sz="4"/>
+              <w:right w:val="single" w:color="999999" w:sz="4"/>
+            </w:tcBorders>
+            <w:shd w:fill="FCE4D6" w:val="clear"/>
+            <w:tcMar>
+              <w:top w:type="dxa" w:w="70"/>
+              <w:left w:type="dxa" w:w="110"/>
+              <w:bottom w:type="dxa" w:w="70"/>
+              <w:right w:type="dxa" w:w="110"/>
+            </w:tcMar>
+          </w:tcPr>
+          <w:p>
+            <w:pPr>
+              <w:jc w:val="center"/>
+            </w:pPr>
+            <w:r>
+              <w:rPr>
+                <w:sz w:val="19"/>
+                <w:szCs w:val="19"/>
+              </w:rPr>
+              <w:t xml:space="preserve">0.76</w:t>
             </w:r>
           </w:p>
         </w:tc>
@@ -4576,7 +4982,7 @@
       <w:tr>
         <w:tc>
           <w:tcPr>
-            <w:tcW w:type="dxa" w:w="3000"/>
+            <w:tcW w:type="dxa" w:w="2400"/>
             <w:tcBorders>
               <w:top w:val="single" w:color="999999" w:sz="4"/>
               <w:left w:val="single" w:color="999999" w:sz="4"/>
@@ -4607,7 +5013,7 @@
         </w:tc>
         <w:tc>
           <w:tcPr>
-            <w:tcW w:type="dxa" w:w="2120"/>
+            <w:tcW w:type="dxa" w:w="1740"/>
             <w:tcBorders>
               <w:top w:val="single" w:color="999999" w:sz="4"/>
               <w:left w:val="single" w:color="999999" w:sz="4"/>
@@ -4638,7 +5044,7 @@
         </w:tc>
         <w:tc>
           <w:tcPr>
-            <w:tcW w:type="dxa" w:w="2120"/>
+            <w:tcW w:type="dxa" w:w="1740"/>
             <w:tcBorders>
               <w:top w:val="single" w:color="999999" w:sz="4"/>
               <w:left w:val="single" w:color="999999" w:sz="4"/>
@@ -4669,7 +5075,7 @@
         </w:tc>
         <w:tc>
           <w:tcPr>
-            <w:tcW w:type="dxa" w:w="2120"/>
+            <w:tcW w:type="dxa" w:w="1740"/>
             <w:tcBorders>
               <w:top w:val="single" w:color="999999" w:sz="4"/>
               <w:left w:val="single" w:color="999999" w:sz="4"/>
@@ -4695,6 +5101,37 @@
                 <w:szCs w:val="19"/>
               </w:rPr>
               <w:t xml:space="preserve">0.95</w:t>
+            </w:r>
+          </w:p>
+        </w:tc>
+        <w:tc>
+          <w:tcPr>
+            <w:tcW w:type="dxa" w:w="1740"/>
+            <w:tcBorders>
+              <w:top w:val="single" w:color="999999" w:sz="4"/>
+              <w:left w:val="single" w:color="999999" w:sz="4"/>
+              <w:bottom w:val="single" w:color="999999" w:sz="4"/>
+              <w:right w:val="single" w:color="999999" w:sz="4"/>
+            </w:tcBorders>
+            <w:tcMar>
+              <w:top w:type="dxa" w:w="70"/>
+              <w:left w:type="dxa" w:w="110"/>
+              <w:bottom w:type="dxa" w:w="70"/>
+              <w:right w:type="dxa" w:w="110"/>
+            </w:tcMar>
+          </w:tcPr>
+          <w:p>
+            <w:pPr>
+              <w:jc w:val="center"/>
+            </w:pPr>
+            <w:r>
+              <w:rPr>
+                <w:b w:val="false"/>
+                <w:bCs w:val="false"/>
+                <w:sz w:val="19"/>
+                <w:szCs w:val="19"/>
+              </w:rPr>
+              <w:t xml:space="preserve">0.71</w:t>
             </w:r>
           </w:p>
         </w:tc>
@@ -4712,7 +5149,7 @@
           <w:sz w:val="20"/>
           <w:szCs w:val="20"/>
         </w:rPr>
-        <w:t xml:space="preserve">Tablo 5. Sınıf bazlı F1 (vurgulu satır: tüm modellerde en zayıf sınıf)</w:t>
+        <w:t xml:space="preserve">Tablo 5. Sınıf bazlı F1 (vurgulu satır: Bağış/Koordinasyon — modellerin çoğunda zayıf nokta)</w:t>
       </w:r>
     </w:p>
     <w:p>
@@ -4739,7 +5176,7 @@
         <w:jc w:val="both"/>
       </w:pPr>
       <w:r>
-        <w:t xml:space="preserve">Modeller arasında belirgin bir ölçek etkisi görülmektedir: 360M (Macro-F1 0.588) → 1.1B (0.908) arasında büyük bir sıçrama vardır; ancak 1.1B → 1.5B (0.914) geçişinde getiri marjinaldir. Bu, ~1 milyar parametre civarında bir doygunluğa işaret eder. Qwen2.5 en yüksek Macro-F1'i (0.914) elde etmiş, güçlü çok dilli/Türkçe eğitimini göstermiştir; ancak TinyLlama neredeyse aynı başarıyı (0.908) yaklaşık %35 daha düşük GPU belleğiyle (3.29 GB'a karşı 5.07 GB) sağlamıştır — verimlilik açısından dikkate değer bir bulgu.</w:t>
+        <w:t xml:space="preserve">Modeller arasındaki ölçek etkisi doğrusal değildir: 360M → 1.1B geçişinde büyük bir sıçrama vardır (Macro-F1 0.588 → 0.908), ancak 1.1B → 1.5B (0.914) marjinaldir. En çarpıcı bulgu, modelimizin en büyüğü olan Gemma-4-E2B'nin (5B ham, ~2B efektif) küçük modellerin gerisinde kalmasıdır (Macro-F1 0.740). Bu, küçük veri rejiminde "daha büyük her zaman daha iyi değildir" tezini destekler. Eğitim sırasında doğrulama kaybının (val loss 3.82) eğitim kaybından (0.003) çok daha yüksek olması, klasik bir aşırı uydurma sinyalidir. Olası nedenler: (i) Gemma-4 için Unsloth'un önerdiği genişletilmiş hedef modüller daha fazla eğitilebilir parametre (31M, diğerlerinin ~7 katı) ve daha hızlı aşırı uydurma; (ii) çok modlu (metin+görüntü+ses) mimarinin saf metin sınıflandırması için optimum olmaması; (iii) T4 üzerinde fp16 emülasyonu. Bu, modelin gücü değil, hiperparametre–veri uyumsuzluğunun sonucudur ve veriyle birlikte LR/epoch'un modele özel ayarlanması gerektiğini gösterir.</w:t>
       </w:r>
     </w:p>
     <w:p>
@@ -4748,7 +5185,16 @@
         <w:jc w:val="both"/>
       </w:pPr>
       <w:r>
-        <w:t xml:space="preserve">QLoRA'nın bellek verimliliği tüm modellerde belirgindir: tepe GPU kullanımı 1.81–5.07 GB aralığında kalmıştır. Eşdeğer bir tam ince ayar (full fine-tuning) onlarca GB gerektireceğinden, bu sonuç düşük maliyetli donanım hedefini doğrulamaktadır.</w:t>
+        <w:t xml:space="preserve">Qwen2.5 en yüksek Macro-F1'i (0.914) elde etmiş, güçlü çok dilli/Türkçe eğitimini göstermiştir; ancak TinyLlama neredeyse aynı başarıyı (0.908) yaklaşık %35 daha düşük GPU belleğiyle (3.29 GB'a karşı 5.07 GB) sağlamıştır — verimlilik açısından dikkate değer bir bulgu. Gemma-4 ise Unsloth optimizasyonu sayesinde en hızlı eğitim süresine (718 s) sahiptir, fakat çıkarım süresi en uzunudur (1798 ms/tweet).</w:t>
+      </w:r>
+    </w:p>
+    <w:p>
+      <w:pPr>
+        <w:spacing w:after="120" w:line="360"/>
+        <w:jc w:val="both"/>
+      </w:pPr>
+      <w:r>
+        <w:t xml:space="preserve">QLoRA'nın bellek verimliliği tüm modellerde belirgindir: tepe GPU kullanımı 1.81–9.73 GB aralığında kalmıştır. Eşdeğer bir tam ince ayar onlarca GB gerektireceğinden, bu sonuç düşük maliyetli donanım hedefini doğrulamaktadır.</w:t>
       </w:r>
     </w:p>
     <w:p>
@@ -4789,7 +5235,7 @@
         <w:jc w:val="both"/>
       </w:pPr>
       <w:r>
-        <w:t xml:space="preserve">En küçük model SmolLM2-360M, az örnekli sınıflarda (Kayıp 0.38, Bağış 0.42, Altyapı 0.59) belirgin biçimde başarısızdır; karışıklık matrisi bu üç sınıfın birbirine karıştığını göstermektedir. Buna karşılık TinyLlama ve Qwen2.5 bu sınıfları büyük ölçüde çözebilmiştir (Kayıp 0.95/0.89, Altyapı 0.95/1.00). Bu bulgu, model kapasitesinin en çok semantik olarak yakın azınlık sınıflarını ayırt etmede fark yarattığını ortaya koymaktadır.</w:t>
+        <w:t xml:space="preserve">En küçük model SmolLM2-360M, az örnekli sınıflarda (Kayıp 0.38, Bağış 0.42, Altyapı 0.59) belirgin biçimde başarısızdır; karışıklık matrisi bu üç sınıfın birbirine karıştığını göstermektedir. Buna karşılık TinyLlama ve Qwen2.5 bu sınıfları büyük ölçüde çözebilmiştir (Kayıp 0.95/0.89, Altyapı 0.95/1.00). Gemma-4 ise farklı bir hata desenine sahiptir: Kayıp Bildirimi'nde recall yalnızca 0.30'a düşmüş (10'da 3), ve 20 "Diğer" örneğinden 6'sını yanlışlıkla "Bağış/Koordinasyon" olarak işaretlemiştir. Bu desen, aşırı uydurma altında modelin baskın sınıflara yönlendiğini gösterir. Genel sonuç: model kapasitesi tek başına yeterli değildir; veri ve hiperparametrelerle uyumu kritiktir.</w:t>
       </w:r>
     </w:p>
     <w:p>
@@ -4872,7 +5318,7 @@
         <w:jc w:val="both"/>
       </w:pPr>
       <w:r>
-        <w:t xml:space="preserve">Üç Küçük Dil Modeli üzerinde yapılan QLoRA ince ayarı, Türkçe afet tweet sınıflandırmasında zero-shot temel çizgiye kıyasla çarpıcı bir iyileşme sağlamıştır (Macro-F1 0.094 → 0.914). Qwen2.5-1.5B en iyi sonucu vermiş, TinyLlama-1.1B ise neredeyse aynı başarıyı daha düşük bellekle elde ederek verimlilik açısından öne çıkmıştır. QLoRA, 5 GB'ın altında tepe bellekle düşük maliyetli donanımda etkili ince ayarı mümkün kılmıştır.</w:t>
+        <w:t xml:space="preserve">Dört Küçük Dil Modeli üzerinde yapılan QLoRA ince ayarı, Türkçe afet tweet sınıflandırmasında zero-shot temel çizgiye kıyasla çarpıcı bir iyileşme sağlamıştır (Macro-F1 0.094 → 0.914). Qwen2.5-1.5B en iyi sonucu vermiş, TinyLlama-1.1B ise neredeyse aynı başarıyı daha düşük bellekle elde ederek verimlilik açısından öne çıkmıştır. En büyük model Gemma-4-E2B beklenenden düşük performans vermiş (Macro-F1 0.740), küçük veri rejiminde "büyük her zaman daha iyi değildir" bulgusunu ortaya koymuştur. QLoRA, 10 GB'ın altında tepe bellekle düşük maliyetli donanımda etkili ince ayarı mümkün kılmıştır.</w:t>
       </w:r>
     </w:p>
     <w:p>
@@ -4920,7 +5366,7 @@
         <w:spacing w:after="80"/>
       </w:pPr>
       <w:r>
-        <w:t xml:space="preserve">Dördüncü model (Gemma-4-E2B) donanım kısıtları nedeniyle bu raporda yer almamış, eklenmek üzere planlanmıştır.</w:t>
+        <w:t xml:space="preserve">Gemma-4 için modele özel hiperparametre araması (LR, epoch sayısı, hedef modüller) yapılmamıştır; ortak reçete tüm modellere uygulanmıştır. Modele özel optimizasyonla Gemma-4'ün skoru muhtemelen artırılabilir.</w:t>
       </w:r>
     </w:p>
     <w:p>
@@ -4946,7 +5392,7 @@
         <w:spacing w:after="80"/>
       </w:pPr>
       <w:r>
-        <w:t xml:space="preserve">Çıkarım süreleri T4 üzerinde bf16 emülasyonuyla ölçülmüştür; edge cihaz performansını birebir yansıtmayabilir.</w:t>
+        <w:t xml:space="preserve">Çıkarım süreleri T4 üzerinde bf16/fp16 emülasyonuyla ölçülmüştür; edge cihaz performansını birebir yansıtmayabilir.</w:t>
       </w:r>
     </w:p>
     <w:p>
@@ -5016,7 +5462,7 @@
         <w:spacing w:after="80"/>
       </w:pPr>
       <w:r>
-        <w:t xml:space="preserve">Gemma-4-E2B'nin dördüncü model olarak eklenmesi (Unsloth ile, T4 uyumlu).</w:t>
+        <w:t xml:space="preserve">Gemma-4-E2B için modele özel hiperparametre araması (epoch=1-2, lr=1e-4) ile aşırı uydurmanın azaltılması.</w:t>
       </w:r>
     </w:p>
     <w:p>
@@ -5073,7 +5519,7 @@
         <w:jc w:val="both"/>
       </w:pPr>
       <w:r>
-        <w:t xml:space="preserve">[1] Toraman, C., et al. (2023). Tweets Under the Rubble: Detection of Messages Calling for Help in Earthquake Disaster. arXiv:2302.13403.</w:t>
+        <w:t xml:space="preserve">[1] Küçüktaş, U. T. (2023). Turkey Earthquake Relief Tweets Dataset. Kaggle. https://www.kaggle.com/datasets/ulkutuncerkucuktas/turkey-earthquake-relief-tweets-dataset  (bu çalışmada kullanılan ham tweet kaynağı)</w:t>
       </w:r>
     </w:p>
     <w:p>
@@ -5082,7 +5528,7 @@
         <w:jc w:val="both"/>
       </w:pPr>
       <w:r>
-        <w:t xml:space="preserve">[2] Dettmers, T., Pagnoni, A., Holtzman, A., &amp; Zettlemoyer, L. (2023). QLoRA: Efficient Finetuning of Quantized LLMs. NeurIPS 2023.</w:t>
+        <w:t xml:space="preserve">[2] Toraman, C., et al. (2023). Tweets Under the Rubble: Detection of Messages Calling for Help in Earthquake Disaster. arXiv:2302.13403.  (ilgili literatür)</w:t>
       </w:r>
     </w:p>
     <w:p>
@@ -5091,7 +5537,7 @@
         <w:jc w:val="both"/>
       </w:pPr>
       <w:r>
-        <w:t xml:space="preserve">[3] Hu, E. J., et al. (2022). LoRA: Low-Rank Adaptation of Large Language Models. ICLR 2022.</w:t>
+        <w:t xml:space="preserve">[3] Dettmers, T., Pagnoni, A., Holtzman, A., &amp; Zettlemoyer, L. (2023). QLoRA: Efficient Finetuning of Quantized LLMs. NeurIPS 2023.</w:t>
       </w:r>
     </w:p>
     <w:p>
@@ -5100,7 +5546,7 @@
         <w:jc w:val="both"/>
       </w:pPr>
       <w:r>
-        <w:t xml:space="preserve">[4] Allal, L. B., et al. (2024). SmolLM2: Data-Centric Training of a Small Language Model. arXiv:2502.02737.</w:t>
+        <w:t xml:space="preserve">[4] Hu, E. J., et al. (2022). LoRA: Low-Rank Adaptation of Large Language Models. ICLR 2022.</w:t>
       </w:r>
     </w:p>
     <w:p>
@@ -5109,7 +5555,7 @@
         <w:jc w:val="both"/>
       </w:pPr>
       <w:r>
-        <w:t xml:space="preserve">[5] Zhang, P., et al. (2024). TinyLlama: An Open-Source Small Language Model.</w:t>
+        <w:t xml:space="preserve">[5] Allal, L. B., et al. (2024). SmolLM2: Data-Centric Training of a Small Language Model. arXiv:2502.02737.</w:t>
       </w:r>
     </w:p>
     <w:p>
@@ -5118,7 +5564,7 @@
         <w:jc w:val="both"/>
       </w:pPr>
       <w:r>
-        <w:t xml:space="preserve">[6] Qwen Team, Alibaba (2024). Qwen2.5 Technical Report.</w:t>
+        <w:t xml:space="preserve">[6] Zhang, P., et al. (2024). TinyLlama: An Open-Source Small Language Model.</w:t>
       </w:r>
     </w:p>
     <w:p>
@@ -5127,7 +5573,16 @@
         <w:jc w:val="both"/>
       </w:pPr>
       <w:r>
-        <w:t xml:space="preserve">[7] Google DeepMind (2024–2026). Gemma Open Models (Gemma 2, 3n, 4).</w:t>
+        <w:t xml:space="preserve">[7] Qwen Team, Alibaba (2024). Qwen2.5 Technical Report.</w:t>
+      </w:r>
+    </w:p>
+    <w:p>
+      <w:pPr>
+        <w:spacing w:after="120" w:line="360"/>
+        <w:jc w:val="both"/>
+      </w:pPr>
+      <w:r>
+        <w:t xml:space="preserve">[8] Google DeepMind (2024–2026). Gemma Open Models (Gemma 2, 3n, 4).</w:t>
       </w:r>
     </w:p>
     <w:sectPr>

</xml_diff>